<commit_message>
updated project delete path to delete children tasks
</commit_message>
<xml_diff>
--- a/test-plans/Project Testing Plan.docx
+++ b/test-plans/Project Testing Plan.docx
@@ -2747,6 +2747,45 @@
       </w:r>
       <w:r>
         <w:t>confirms deleted with correct ID</w:t>
+      </w:r>
+    </w:p>
+    <w:p>
+      <w:pPr>
+        <w:spacing w:after="0" w:line="240" w:lineRule="auto"/>
+        <w:ind w:left="1440" w:firstLine="720"/>
+      </w:pPr>
+    </w:p>
+    <w:p>
+      <w:pPr>
+        <w:spacing w:after="0" w:line="240" w:lineRule="auto"/>
+        <w:ind w:left="1440" w:firstLine="720"/>
+        <w:rPr>
+          <w:u w:val="single"/>
+        </w:rPr>
+      </w:pPr>
+      <w:r>
+        <w:rPr>
+          <w:u w:val="single"/>
+        </w:rPr>
+        <w:t>Children Deleted</w:t>
+      </w:r>
+    </w:p>
+    <w:p>
+      <w:pPr>
+        <w:spacing w:after="0" w:line="240" w:lineRule="auto"/>
+        <w:ind w:left="1440" w:firstLine="720"/>
+      </w:pPr>
+      <w:r>
+        <w:rPr>
+          <w:rFonts w:cstheme="minorHAnsi"/>
+        </w:rPr>
+        <w:t>□</w:t>
+      </w:r>
+      <w:r>
+        <w:t xml:space="preserve"> </w:t>
+      </w:r>
+      <w:r>
+        <w:t>confirm affiliated tasks deleted</w:t>
       </w:r>
     </w:p>
     <w:p>
@@ -3313,7 +3352,7 @@
   <w:style w:type="paragraph" w:default="1" w:styleId="Normal">
     <w:name w:val="Normal"/>
     <w:qFormat/>
-    <w:rsid w:val="00337214"/>
+    <w:rsid w:val="006F6E7E"/>
   </w:style>
   <w:style w:type="paragraph" w:styleId="Heading1">
     <w:name w:val="heading 1"/>

</xml_diff>